<commit_message>
docs: complete PR7 verification report
</commit_message>
<xml_diff>
--- a/Отчёты/Практическая работа №7.docx
+++ b/Отчёты/Практическая работа №7.docx
@@ -2620,7 +2620,7 @@
     </w:p>
     <w:p>
       <w:r>
-        <w:t>Pull Request: https://github.com/FireFly4ik/devops-course-2026/pull/3 — влит в main. Коммит работы d069cfb, коммит слияния 03f30e2. main зеркала синхронизирован. Word-отчёт хранится локально.</w:t>
+        <w:t>Pull Request: https://github.com/FireFly4ik/devops-course-2026/pull/3 — влит в main. Коммит работы d069cfb, коммит слияния 03f30e2. main зеркала синхронизирован. Word-отчёт опубликован отдельным коммитом с тегом PR7.</w:t>
       </w:r>
     </w:p>
     <w:p>
@@ -2848,6 +2848,92 @@
     <w:p>
       <w:r>
         <w:t>Затруднение: имя devops.local первоначально не разрешалось внутри VM. Добавлена локальная запись hosts, после чего запросы с проверкой сертификата прошли. Для проверки доступа с Mac использован Chrome. Серверная часть выполнена в консоли VirtualBox; файлы доставлялись через rsync с обязательным --exclude=.env.</w:t>
+      </w:r>
+    </w:p>
+    <w:p>
+      <w:pPr>
+        <w:pStyle w:val="Heading1"/>
+        <w:pageBreakBefore/>
+      </w:pPr>
+      <w:r>
+        <w:t>Дополнительная проверка и актуализация инструкции</w:t>
+      </w:r>
+    </w:p>
+    <w:p>
+      <w:r>
+        <w:t>Восстановление разделено по этапам: --stage ssh для ПР №5, --stage web для ПР №6, --stage docker либо запуск без аргументов для ПР №7. Явный выбор исключает ошибочное ожидание Docker после восстановления чистого сервера.</w:t>
+      </w:r>
+    </w:p>
+    <w:p>
+      <w:pPr>
+        <w:pStyle w:val="Commands"/>
+        <w:keepLines/>
+        <w:spacing w:after="100"/>
+      </w:pPr>
+      <w:r>
+        <w:t>$ sudo bash /home/devops/audit.sh</w:t>
+        <w:br/>
+        <w:t>Пройдено: 14, не пройдено: 0</w:t>
+        <w:br/>
+        <w:t>$ echo $?</w:t>
+        <w:br/>
+        <w:t>0</w:t>
+      </w:r>
+    </w:p>
+    <w:p>
+      <w:pPr>
+        <w:keepNext/>
+        <w:jc w:val="center"/>
+      </w:pPr>
+      <w:r>
+        <w:drawing>
+          <wp:inline xmlns:a="http://schemas.openxmlformats.org/drawingml/2006/main" xmlns:pic="http://schemas.openxmlformats.org/drawingml/2006/picture">
+            <wp:extent cx="6120000" cy="3392410"/>
+            <wp:docPr id="1468553569" name="Picture 1468553569"/>
+            <wp:cNvGraphicFramePr>
+              <a:graphicFrameLocks noChangeAspect="1"/>
+            </wp:cNvGraphicFramePr>
+            <a:graphic>
+              <a:graphicData uri="http://schemas.openxmlformats.org/drawingml/2006/picture">
+                <pic:pic>
+                  <pic:nvPicPr>
+                    <pic:cNvPr id="0" name="10-final-audit.png"/>
+                    <pic:cNvPicPr/>
+                  </pic:nvPicPr>
+                  <pic:blipFill>
+                    <a:blip r:embed="rId24"/>
+                    <a:srcRect b="11415"/>
+                    <a:stretch>
+                      <a:fillRect/>
+                    </a:stretch>
+                  </pic:blipFill>
+                  <pic:spPr>
+                    <a:xfrm>
+                      <a:off x="0" y="0"/>
+                      <a:ext cx="6120000" cy="3392410"/>
+                    </a:xfrm>
+                    <a:prstGeom prst="rect"/>
+                  </pic:spPr>
+                </pic:pic>
+              </a:graphicData>
+            </a:graphic>
+          </wp:inline>
+        </w:drawing>
+      </w:r>
+    </w:p>
+    <w:p>
+      <w:pPr>
+        <w:pStyle w:val="Caption"/>
+        <w:keepNext w:val="0"/>
+        <w:jc w:val="center"/>
+      </w:pPr>
+      <w:r>
+        <w:t>Итоговый аудит и сохранённая безопасная конфигурация</w:t>
+      </w:r>
+    </w:p>
+    <w:p>
+      <w:r>
+        <w:t>Word-отчёт опубликован отдельным коммитом с тегом PR7 в основном репозитории и зеркале. Секрет .env и закрытые ключи в коммит не включены.</w:t>
       </w:r>
     </w:p>
     <w:sectPr>

</xml_diff>